<commit_message>
added notes about terraform
</commit_message>
<xml_diff>
--- a/terraform/terraform notes.docx
+++ b/terraform/terraform notes.docx
@@ -1494,94 +1494,211 @@
         <w:rPr>
           <w:lang w:val="pl-PL"/>
         </w:rPr>
-        <w:t>We use for that the azurerm_virtual_machine_extension resource. In the settings block, commandToExecute value we are entering our bash script to execute.</w:t>
-      </w:r>
-    </w:p>
-    <w:p>
-      <w:pPr>
-        <w:rPr>
-          <w:lang w:val="pl-PL"/>
-        </w:rPr>
-      </w:pPr>
-    </w:p>
-    <w:p>
-      <w:pPr>
-        <w:rPr>
-          <w:lang w:val="pl-PL"/>
-        </w:rPr>
-      </w:pPr>
-      <w:r>
-        <w:rPr>
-          <w:lang w:val="pl-PL"/>
-        </w:rPr>
-        <w:t>If we want to pass a mulitline script we can create  a bash script file and use the following syntax:</w:t>
-      </w:r>
-    </w:p>
-    <w:p>
-      <w:pPr>
-        <w:rPr>
-          <w:lang w:val="pl-PL"/>
-        </w:rPr>
-      </w:pPr>
-    </w:p>
-    <w:p>
-      <w:r>
+        <w:t xml:space="preserve">We use for that the azurerm_virtual_machine_extension resource. </w:t>
+      </w:r>
+      <w:r>
+        <w:rPr>
+          <w:lang w:val="pl-PL"/>
+        </w:rPr>
+        <w:t xml:space="preserve">It uses a virtual machines extension to run a bash script. More info about how to run a bash script using the virtual machine extension here: </w:t>
+      </w:r>
+      <w:hyperlink r:id="rId11" w:history="1">
+        <w:r>
+          <w:rPr>
+            <w:rStyle w:val="Hyperlink"/>
+            <w:lang w:val="pl-PL"/>
+          </w:rPr>
+          <w:t>learn.microsoft.com</w:t>
+        </w:r>
+      </w:hyperlink>
+      <w:r>
+        <w:rPr>
+          <w:lang w:val="pl-PL"/>
+        </w:rPr>
+        <w:t>.</w:t>
+      </w:r>
+    </w:p>
+    <w:p>
+      <w:pPr>
+        <w:rPr>
+          <w:lang w:val="pl-PL"/>
+        </w:rPr>
+      </w:pPr>
+    </w:p>
+    <w:p>
+      <w:pPr>
+        <w:rPr>
+          <w:lang w:val="pl-PL"/>
+        </w:rPr>
+      </w:pPr>
+      <w:r>
+        <w:rPr>
+          <w:lang w:val="pl-PL"/>
+        </w:rPr>
+        <w:t xml:space="preserve">We can use the templatefile function in order to insert variables into a bash script and then run that script on a VM using the </w:t>
+      </w:r>
+      <w:r>
+        <w:rPr>
+          <w:lang w:val="pl-PL"/>
+        </w:rPr>
+        <w:t>azurerm_virtual_machine_extension</w:t>
+      </w:r>
+      <w:r>
+        <w:rPr>
+          <w:lang w:val="pl-PL"/>
+        </w:rPr>
+        <w:t xml:space="preserve"> resource:</w:t>
+      </w:r>
+    </w:p>
+    <w:p>
+      <w:pPr>
+        <w:rPr>
+          <w:lang w:val="pl-PL"/>
+        </w:rPr>
+      </w:pPr>
+      <w:r>
+        <w:rPr>
+          <w:lang w:val="pl-PL"/>
+        </w:rPr>
         <w:lastRenderedPageBreak/>
-        <w:t>settings = &lt;&lt;SETTINGS</w:t>
-      </w:r>
-    </w:p>
-    <w:p>
-      <w:r>
-        <w:t xml:space="preserve">    {</w:t>
-      </w:r>
-    </w:p>
-    <w:p>
-      <w:r>
-        <w:t xml:space="preserve">        "script": "${filebase64("custom_script.sh")}"</w:t>
-      </w:r>
-    </w:p>
-    <w:p>
-      <w:r>
-        <w:t xml:space="preserve">    }</w:t>
-      </w:r>
-    </w:p>
-    <w:p>
-      <w:r>
-        <w:t>SETTINGS</w:t>
-      </w:r>
-    </w:p>
-    <w:p>
-      <w:pPr>
-        <w:rPr>
-          <w:lang w:val="pl-PL"/>
-        </w:rPr>
-      </w:pPr>
-    </w:p>
-    <w:p>
-      <w:pPr>
-        <w:rPr>
-          <w:lang w:val="pl-PL"/>
-        </w:rPr>
-      </w:pPr>
-      <w:r>
-        <w:rPr>
-          <w:lang w:val="pl-PL"/>
-        </w:rPr>
-        <w:t>Where custom_script.sh is a bash script saved in our Terraform folder.</w:t>
+        <w:drawing>
+          <wp:inline distT="0" distB="0" distL="0" distR="0" wp14:anchorId="6906EC10" wp14:editId="445D92D2">
+            <wp:extent cx="4059936" cy="2001340"/>
+            <wp:effectExtent l="0" t="0" r="0" b="0"/>
+            <wp:docPr id="323110050" name="Picture 1" descr="A screenshot of a computer program&#10;&#10;AI-generated content may be incorrect."/>
+            <wp:cNvGraphicFramePr>
+              <a:graphicFrameLocks xmlns:a="http://schemas.openxmlformats.org/drawingml/2006/main" noChangeAspect="1"/>
+            </wp:cNvGraphicFramePr>
+            <a:graphic xmlns:a="http://schemas.openxmlformats.org/drawingml/2006/main">
+              <a:graphicData uri="http://schemas.openxmlformats.org/drawingml/2006/picture">
+                <pic:pic xmlns:pic="http://schemas.openxmlformats.org/drawingml/2006/picture">
+                  <pic:nvPicPr>
+                    <pic:cNvPr id="323110050" name="Picture 1" descr="A screenshot of a computer program&#10;&#10;AI-generated content may be incorrect."/>
+                    <pic:cNvPicPr/>
+                  </pic:nvPicPr>
+                  <pic:blipFill>
+                    <a:blip r:embed="rId12"/>
+                    <a:stretch>
+                      <a:fillRect/>
+                    </a:stretch>
+                  </pic:blipFill>
+                  <pic:spPr>
+                    <a:xfrm>
+                      <a:off x="0" y="0"/>
+                      <a:ext cx="4068342" cy="2005484"/>
+                    </a:xfrm>
+                    <a:prstGeom prst="rect">
+                      <a:avLst/>
+                    </a:prstGeom>
+                  </pic:spPr>
+                </pic:pic>
+              </a:graphicData>
+            </a:graphic>
+          </wp:inline>
+        </w:drawing>
       </w:r>
     </w:p>
     <w:p>
       <w:pPr>
         <w:pStyle w:val="Heading1"/>
-        <w:rPr>
-          <w:lang w:val="pl-PL"/>
-        </w:rPr>
-      </w:pPr>
-      <w:r>
-        <w:rPr>
-          <w:lang w:val="pl-PL"/>
-        </w:rPr>
-        <w:t>Modules and providers</w:t>
+      </w:pPr>
+      <w:r>
+        <w:t>Configuration management</w:t>
+      </w:r>
+    </w:p>
+    <w:p>
+      <w:r>
+        <w:t>We can use Ansible for configuration management. For example it can configure VMs created by Terraform. It can interact with an operating system of that VM.</w:t>
+      </w:r>
+    </w:p>
+    <w:p>
+      <w:pPr>
+        <w:pStyle w:val="Heading1"/>
+      </w:pPr>
+      <w:r>
+        <w:t>State file</w:t>
+      </w:r>
+    </w:p>
+    <w:p>
+      <w:r>
+        <w:t>The state file describes what infrastructure we have created. Based on that file and our code Terraform will determine which resources need to be created or deleted.</w:t>
+      </w:r>
+    </w:p>
+    <w:p>
+      <w:pPr>
+        <w:pStyle w:val="Heading1"/>
+      </w:pPr>
+      <w:r>
+        <w:t>Terraform import</w:t>
+      </w:r>
+    </w:p>
+    <w:p>
+      <w:r>
+        <w:t>Get info about the existing infrastructure. It updated the state file but not configuration files (files with our code). We can use commands, like for example ‘terraform show’, to see the configuration for our current state file and then we can add it to our code files.</w:t>
+      </w:r>
+    </w:p>
+    <w:p>
+      <w:pPr>
+        <w:pStyle w:val="Heading1"/>
+      </w:pPr>
+      <w:r>
+        <w:t>Data block</w:t>
+      </w:r>
+    </w:p>
+    <w:p>
+      <w:r>
+        <w:t>It gets information about currently existing resources in cloud</w:t>
+      </w:r>
+      <w:r>
+        <w:t xml:space="preserve"> even if they have not been created by Terraform.</w:t>
+      </w:r>
+    </w:p>
+    <w:p>
+      <w:pPr>
+        <w:pStyle w:val="Heading1"/>
+      </w:pPr>
+      <w:r>
+        <w:t>Modules</w:t>
+      </w:r>
+    </w:p>
+    <w:p>
+      <w:pPr>
+        <w:pStyle w:val="Heading2"/>
+      </w:pPr>
+      <w:r>
+        <w:t>Public modules on Terraform website</w:t>
+      </w:r>
+    </w:p>
+    <w:p>
+      <w:r>
+        <w:t>There are available modules on the terraform website. They are prepared for creating specific resources. They can be used as an example how to create resources.</w:t>
+      </w:r>
+    </w:p>
+    <w:p>
+      <w:pPr>
+        <w:pStyle w:val="Heading2"/>
+        <w:rPr>
+          <w:lang w:val="pl-PL"/>
+        </w:rPr>
+      </w:pPr>
+      <w:r>
+        <w:rPr>
+          <w:lang w:val="pl-PL"/>
+        </w:rPr>
+        <w:lastRenderedPageBreak/>
+        <w:t>P</w:t>
+      </w:r>
+      <w:r>
+        <w:rPr>
+          <w:lang w:val="pl-PL"/>
+        </w:rPr>
+        <w:t>roviders</w:t>
+      </w:r>
+      <w:r>
+        <w:rPr>
+          <w:lang w:val="pl-PL"/>
+        </w:rPr>
+        <w:t xml:space="preserve"> in modules</w:t>
       </w:r>
     </w:p>
     <w:p>
@@ -1603,9 +1720,283 @@
         <w:t>in the module we need to specify providers even though we have those providers defined in the root module.</w:t>
       </w:r>
     </w:p>
-    <w:p/>
-    <w:p/>
-    <w:p/>
+    <w:p>
+      <w:pPr>
+        <w:pStyle w:val="Heading1"/>
+      </w:pPr>
+      <w:r>
+        <w:t>Terraform console</w:t>
+      </w:r>
+    </w:p>
+    <w:p>
+      <w:r>
+        <w:t>We can use the ‘terraform console’ command which will create a consol</w:t>
+      </w:r>
+      <w:r>
+        <w:t>e</w:t>
+      </w:r>
+      <w:r>
+        <w:t xml:space="preserve"> where we can test terraform commands, like different terraform functions.</w:t>
+      </w:r>
+    </w:p>
+    <w:p>
+      <w:pPr>
+        <w:pStyle w:val="Heading1"/>
+      </w:pPr>
+      <w:r>
+        <w:t>Drift</w:t>
+      </w:r>
+    </w:p>
+    <w:p>
+      <w:r>
+        <w:t>Drift is a situation when resources in cloud are different then those defined in Terraform configuration files. That when some resources have been created manually or by a different tool than Terraform. There are some tools in Terraform helping with that.</w:t>
+      </w:r>
+    </w:p>
+    <w:p>
+      <w:pPr>
+        <w:pStyle w:val="Heading1"/>
+      </w:pPr>
+      <w:r>
+        <w:t>Testing</w:t>
+      </w:r>
+    </w:p>
+    <w:p>
+      <w:r>
+        <w:t xml:space="preserve">There </w:t>
+      </w:r>
+      <w:r>
+        <w:t>are</w:t>
+      </w:r>
+      <w:r>
+        <w:t xml:space="preserve"> tool</w:t>
+      </w:r>
+      <w:r>
+        <w:t>s helping with testing if our code is correct. Not only if that code will work without errors but if it is gonna work as excpected</w:t>
+      </w:r>
+      <w:r>
+        <w:t xml:space="preserve"> and we are not violating any </w:t>
+      </w:r>
+      <w:r>
+        <w:t xml:space="preserve">common </w:t>
+      </w:r>
+      <w:r>
+        <w:t>rules.</w:t>
+      </w:r>
+    </w:p>
+    <w:p>
+      <w:pPr>
+        <w:pStyle w:val="Heading2"/>
+      </w:pPr>
+      <w:r>
+        <w:t>TFLint</w:t>
+      </w:r>
+    </w:p>
+    <w:p>
+      <w:r>
+        <w:t>The TFLint is a tool for testing if Terraform code is correct. It knows what are the available values for different arguments and can detect errors, for example if we use the ‘banana’ as argument for VM size it will know it is not acceptable value.</w:t>
+      </w:r>
+    </w:p>
+    <w:p>
+      <w:pPr>
+        <w:pStyle w:val="Heading2"/>
+      </w:pPr>
+      <w:r>
+        <w:t>Checkov</w:t>
+      </w:r>
+    </w:p>
+    <w:p>
+      <w:r>
+        <w:t>The checkov is a tool for checking if we are exposing confidential data in our code</w:t>
+      </w:r>
+      <w:r>
+        <w:t xml:space="preserve"> or if we are following the recommended best practices for our code, like do we have all the recommended settings.</w:t>
+      </w:r>
+    </w:p>
+    <w:p>
+      <w:r>
+        <w:t>It also allows us to define our own rules (policies) which should be followed when writing a code and it can automatically validate them.</w:t>
+      </w:r>
+    </w:p>
+    <w:p>
+      <w:r>
+        <w:t>Another similar tools:</w:t>
+      </w:r>
+    </w:p>
+    <w:p>
+      <w:pPr>
+        <w:pStyle w:val="ListParagraph"/>
+        <w:numPr>
+          <w:ilvl w:val="0"/>
+          <w:numId w:val="5"/>
+        </w:numPr>
+      </w:pPr>
+      <w:r>
+        <w:t>Terrascan</w:t>
+      </w:r>
+    </w:p>
+    <w:p>
+      <w:pPr>
+        <w:pStyle w:val="ListParagraph"/>
+        <w:numPr>
+          <w:ilvl w:val="0"/>
+          <w:numId w:val="5"/>
+        </w:numPr>
+      </w:pPr>
+      <w:r>
+        <w:t>Trivy</w:t>
+      </w:r>
+    </w:p>
+    <w:p>
+      <w:pPr>
+        <w:pStyle w:val="ListParagraph"/>
+        <w:numPr>
+          <w:ilvl w:val="0"/>
+          <w:numId w:val="5"/>
+        </w:numPr>
+      </w:pPr>
+      <w:r>
+        <w:t>Sentinel</w:t>
+      </w:r>
+    </w:p>
+    <w:p>
+      <w:pPr>
+        <w:pStyle w:val="ListParagraph"/>
+        <w:numPr>
+          <w:ilvl w:val="0"/>
+          <w:numId w:val="5"/>
+        </w:numPr>
+      </w:pPr>
+      <w:r>
+        <w:lastRenderedPageBreak/>
+        <w:t>Snyk</w:t>
+      </w:r>
+    </w:p>
+    <w:p>
+      <w:pPr>
+        <w:pStyle w:val="ListParagraph"/>
+        <w:numPr>
+          <w:ilvl w:val="0"/>
+          <w:numId w:val="5"/>
+        </w:numPr>
+      </w:pPr>
+      <w:r>
+        <w:t>Mondoo</w:t>
+      </w:r>
+    </w:p>
+    <w:p>
+      <w:pPr>
+        <w:pStyle w:val="ListParagraph"/>
+        <w:numPr>
+          <w:ilvl w:val="0"/>
+          <w:numId w:val="5"/>
+        </w:numPr>
+      </w:pPr>
+      <w:r>
+        <w:t>Terratest</w:t>
+      </w:r>
+    </w:p>
+    <w:p>
+      <w:pPr>
+        <w:pStyle w:val="Heading2"/>
+      </w:pPr>
+      <w:r>
+        <w:t>Terraform tools</w:t>
+      </w:r>
+    </w:p>
+    <w:p>
+      <w:pPr>
+        <w:pStyle w:val="Heading3"/>
+      </w:pPr>
+      <w:r>
+        <w:t>Check block</w:t>
+      </w:r>
+    </w:p>
+    <w:p>
+      <w:r>
+        <w:t>Check blocks are used to check if resources have been created correctly. They use the data block to get information about the created resources.</w:t>
+      </w:r>
+    </w:p>
+    <w:p>
+      <w:pPr>
+        <w:pStyle w:val="Heading3"/>
+      </w:pPr>
+      <w:r>
+        <w:t>Lifecycle block</w:t>
+      </w:r>
+    </w:p>
+    <w:p>
+      <w:r>
+        <w:t>Lifecycle blocks can be used to check if all requirements are met before creating resources, and like check blocks they can check if resources have been created properly.</w:t>
+      </w:r>
+    </w:p>
+    <w:p>
+      <w:pPr>
+        <w:pStyle w:val="Heading3"/>
+      </w:pPr>
+      <w:r>
+        <w:t>Assert block</w:t>
+      </w:r>
+    </w:p>
+    <w:p>
+      <w:r>
+        <w:t>Assert block can be used for testing our code.</w:t>
+      </w:r>
+    </w:p>
+    <w:p>
+      <w:pPr>
+        <w:pStyle w:val="Heading3"/>
+      </w:pPr>
+      <w:r>
+        <w:t>Mocking</w:t>
+      </w:r>
+    </w:p>
+    <w:p>
+      <w:r>
+        <w:t>There is the mocking option in Terraform for testing our code.</w:t>
+      </w:r>
+    </w:p>
+    <w:p>
+      <w:pPr>
+        <w:pStyle w:val="Heading3"/>
+      </w:pPr>
+      <w:r>
+        <w:t>Variables v</w:t>
+      </w:r>
+      <w:r>
+        <w:t>alidation</w:t>
+      </w:r>
+    </w:p>
+    <w:p>
+      <w:r>
+        <w:t>We can use the validation argument in a variable in order to validate if the entered values for that variable is correct.</w:t>
+      </w:r>
+    </w:p>
+    <w:p>
+      <w:pPr>
+        <w:pStyle w:val="Heading3"/>
+      </w:pPr>
+      <w:r>
+        <w:t>Terraform test cli</w:t>
+      </w:r>
+    </w:p>
+    <w:p>
+      <w:r>
+        <w:t>There is the Terraform test cli tool which can be used for testing as well.</w:t>
+      </w:r>
+    </w:p>
+    <w:p>
+      <w:pPr>
+        <w:pStyle w:val="Heading1"/>
+      </w:pPr>
+      <w:r>
+        <w:t>Terraform docs</w:t>
+      </w:r>
+    </w:p>
+    <w:p>
+      <w:r>
+        <w:t>It is a tool which we can use for documenting our Terraform code.</w:t>
+      </w:r>
+    </w:p>
     <w:sectPr>
       <w:pgSz w:w="12240" w:h="15840"/>
       <w:pgMar w:top="1440" w:right="1440" w:bottom="1440" w:left="1440" w:header="720" w:footer="720" w:gutter="0"/>
@@ -1619,9 +2010,122 @@
 <file path=word/numbering.xml><?xml version="1.0" encoding="utf-8"?>
 <w:numbering xmlns:wpc="http://schemas.microsoft.com/office/word/2010/wordprocessingCanvas" xmlns:cx="http://schemas.microsoft.com/office/drawing/2014/chartex" xmlns:cx1="http://schemas.microsoft.com/office/drawing/2015/9/8/chartex" xmlns:cx2="http://schemas.microsoft.com/office/drawing/2015/10/21/chartex" xmlns:cx3="http://schemas.microsoft.com/office/drawing/2016/5/9/chartex" xmlns:cx4="http://schemas.microsoft.com/office/drawing/2016/5/10/chartex" xmlns:cx5="http://schemas.microsoft.com/office/drawing/2016/5/11/chartex" xmlns:cx6="http://schemas.microsoft.com/office/drawing/2016/5/12/chartex" xmlns:cx7="http://schemas.microsoft.com/office/drawing/2016/5/13/chartex" xmlns:cx8="http://schemas.microsoft.com/office/drawing/2016/5/14/chartex" xmlns:mc="http://schemas.openxmlformats.org/markup-compatibility/2006" xmlns:aink="http://schemas.microsoft.com/office/drawing/2016/ink" xmlns:am3d="http://schemas.microsoft.com/office/drawing/2017/model3d" xmlns:o="urn:schemas-microsoft-com:office:office" xmlns:oel="http://schemas.microsoft.com/office/2019/extlst" xmlns:r="http://schemas.openxmlformats.org/officeDocument/2006/relationships" xmlns:m="http://schemas.openxmlformats.org/officeDocument/2006/math" xmlns:v="urn:schemas-microsoft-com:vml" xmlns:wp14="http://schemas.microsoft.com/office/word/2010/wordprocessingDrawing" xmlns:wp="http://schemas.openxmlformats.org/drawingml/2006/wordprocessingDrawing" xmlns:w10="urn:schemas-microsoft-com:office:word" xmlns:w="http://schemas.openxmlformats.org/wordprocessingml/2006/main" xmlns:w14="http://schemas.microsoft.com/office/word/2010/wordml" xmlns:w15="http://schemas.microsoft.com/office/word/2012/wordml" xmlns:w16cex="http://schemas.microsoft.com/office/word/2018/wordml/cex" xmlns:w16cid="http://schemas.microsoft.com/office/word/2016/wordml/cid" xmlns:w16="http://schemas.microsoft.com/office/word/2018/wordml" xmlns:w16du="http://schemas.microsoft.com/office/word/2023/wordml/word16du" xmlns:w16sdtdh="http://schemas.microsoft.com/office/word/2020/wordml/sdtdatahash" xmlns:w16sdtfl="http://schemas.microsoft.com/office/word/2024/wordml/sdtformatlock" xmlns:w16se="http://schemas.microsoft.com/office/word/2015/wordml/symex" xmlns:wpg="http://schemas.microsoft.com/office/word/2010/wordprocessingGroup" xmlns:wpi="http://schemas.microsoft.com/office/word/2010/wordprocessingInk" xmlns:wne="http://schemas.microsoft.com/office/word/2006/wordml" xmlns:wps="http://schemas.microsoft.com/office/word/2010/wordprocessingShape" mc:Ignorable="w14 w15 w16se w16cid w16 w16cex w16sdtdh w16sdtfl w16du wp14">
   <w:abstractNum w:abstractNumId="0" w15:restartNumberingAfterBreak="0">
+    <w:nsid w:val="13EC7976"/>
+    <w:multiLevelType w:val="hybridMultilevel"/>
+    <w:tmpl w:val="F2184AFC"/>
+    <w:lvl w:ilvl="0" w:tplc="04090001">
+      <w:start w:val="1"/>
+      <w:numFmt w:val="bullet"/>
+      <w:lvlText w:val=""/>
+      <w:lvlJc w:val="left"/>
+      <w:pPr>
+        <w:ind w:left="720" w:hanging="360"/>
+      </w:pPr>
+      <w:rPr>
+        <w:rFonts w:ascii="Symbol" w:hAnsi="Symbol" w:hint="default"/>
+      </w:rPr>
+    </w:lvl>
+    <w:lvl w:ilvl="1" w:tplc="04090003" w:tentative="1">
+      <w:start w:val="1"/>
+      <w:numFmt w:val="bullet"/>
+      <w:lvlText w:val="o"/>
+      <w:lvlJc w:val="left"/>
+      <w:pPr>
+        <w:ind w:left="1440" w:hanging="360"/>
+      </w:pPr>
+      <w:rPr>
+        <w:rFonts w:ascii="Courier New" w:hAnsi="Courier New" w:cs="Courier New" w:hint="default"/>
+      </w:rPr>
+    </w:lvl>
+    <w:lvl w:ilvl="2" w:tplc="04090005" w:tentative="1">
+      <w:start w:val="1"/>
+      <w:numFmt w:val="bullet"/>
+      <w:lvlText w:val=""/>
+      <w:lvlJc w:val="left"/>
+      <w:pPr>
+        <w:ind w:left="2160" w:hanging="360"/>
+      </w:pPr>
+      <w:rPr>
+        <w:rFonts w:ascii="Wingdings" w:hAnsi="Wingdings" w:hint="default"/>
+      </w:rPr>
+    </w:lvl>
+    <w:lvl w:ilvl="3" w:tplc="04090001" w:tentative="1">
+      <w:start w:val="1"/>
+      <w:numFmt w:val="bullet"/>
+      <w:lvlText w:val=""/>
+      <w:lvlJc w:val="left"/>
+      <w:pPr>
+        <w:ind w:left="2880" w:hanging="360"/>
+      </w:pPr>
+      <w:rPr>
+        <w:rFonts w:ascii="Symbol" w:hAnsi="Symbol" w:hint="default"/>
+      </w:rPr>
+    </w:lvl>
+    <w:lvl w:ilvl="4" w:tplc="04090003" w:tentative="1">
+      <w:start w:val="1"/>
+      <w:numFmt w:val="bullet"/>
+      <w:lvlText w:val="o"/>
+      <w:lvlJc w:val="left"/>
+      <w:pPr>
+        <w:ind w:left="3600" w:hanging="360"/>
+      </w:pPr>
+      <w:rPr>
+        <w:rFonts w:ascii="Courier New" w:hAnsi="Courier New" w:cs="Courier New" w:hint="default"/>
+      </w:rPr>
+    </w:lvl>
+    <w:lvl w:ilvl="5" w:tplc="04090005" w:tentative="1">
+      <w:start w:val="1"/>
+      <w:numFmt w:val="bullet"/>
+      <w:lvlText w:val=""/>
+      <w:lvlJc w:val="left"/>
+      <w:pPr>
+        <w:ind w:left="4320" w:hanging="360"/>
+      </w:pPr>
+      <w:rPr>
+        <w:rFonts w:ascii="Wingdings" w:hAnsi="Wingdings" w:hint="default"/>
+      </w:rPr>
+    </w:lvl>
+    <w:lvl w:ilvl="6" w:tplc="04090001" w:tentative="1">
+      <w:start w:val="1"/>
+      <w:numFmt w:val="bullet"/>
+      <w:lvlText w:val=""/>
+      <w:lvlJc w:val="left"/>
+      <w:pPr>
+        <w:ind w:left="5040" w:hanging="360"/>
+      </w:pPr>
+      <w:rPr>
+        <w:rFonts w:ascii="Symbol" w:hAnsi="Symbol" w:hint="default"/>
+      </w:rPr>
+    </w:lvl>
+    <w:lvl w:ilvl="7" w:tplc="04090003" w:tentative="1">
+      <w:start w:val="1"/>
+      <w:numFmt w:val="bullet"/>
+      <w:lvlText w:val="o"/>
+      <w:lvlJc w:val="left"/>
+      <w:pPr>
+        <w:ind w:left="5760" w:hanging="360"/>
+      </w:pPr>
+      <w:rPr>
+        <w:rFonts w:ascii="Courier New" w:hAnsi="Courier New" w:cs="Courier New" w:hint="default"/>
+      </w:rPr>
+    </w:lvl>
+    <w:lvl w:ilvl="8" w:tplc="04090005" w:tentative="1">
+      <w:start w:val="1"/>
+      <w:numFmt w:val="bullet"/>
+      <w:lvlText w:val=""/>
+      <w:lvlJc w:val="left"/>
+      <w:pPr>
+        <w:ind w:left="6480" w:hanging="360"/>
+      </w:pPr>
+      <w:rPr>
+        <w:rFonts w:ascii="Wingdings" w:hAnsi="Wingdings" w:hint="default"/>
+      </w:rPr>
+    </w:lvl>
+  </w:abstractNum>
+  <w:abstractNum w:abstractNumId="1" w15:restartNumberingAfterBreak="0">
     <w:nsid w:val="1EFA1537"/>
     <w:multiLevelType w:val="hybridMultilevel"/>
-    <w:tmpl w:val="108887C6"/>
+    <w:tmpl w:val="DC041C3A"/>
     <w:lvl w:ilvl="0" w:tplc="04090001">
       <w:start w:val="1"/>
       <w:numFmt w:val="bullet"/>
@@ -1731,7 +2235,7 @@
       </w:rPr>
     </w:lvl>
   </w:abstractNum>
-  <w:abstractNum w:abstractNumId="1" w15:restartNumberingAfterBreak="0">
+  <w:abstractNum w:abstractNumId="2" w15:restartNumberingAfterBreak="0">
     <w:nsid w:val="2D240C4D"/>
     <w:multiLevelType w:val="hybridMultilevel"/>
     <w:tmpl w:val="E9948B3A"/>
@@ -1868,7 +2372,7 @@
       </w:rPr>
     </w:lvl>
   </w:abstractNum>
-  <w:abstractNum w:abstractNumId="2" w15:restartNumberingAfterBreak="0">
+  <w:abstractNum w:abstractNumId="3" w15:restartNumberingAfterBreak="0">
     <w:nsid w:val="367AE1FC"/>
     <w:multiLevelType w:val="multilevel"/>
     <w:tmpl w:val="367AE1FC"/>
@@ -2008,7 +2512,7 @@
       </w:rPr>
     </w:lvl>
   </w:abstractNum>
-  <w:abstractNum w:abstractNumId="3" w15:restartNumberingAfterBreak="0">
+  <w:abstractNum w:abstractNumId="4" w15:restartNumberingAfterBreak="0">
     <w:nsid w:val="3CB06121"/>
     <w:multiLevelType w:val="hybridMultilevel"/>
     <w:tmpl w:val="811451FA"/>
@@ -2145,7 +2649,7 @@
       </w:rPr>
     </w:lvl>
   </w:abstractNum>
-  <w:abstractNum w:abstractNumId="4" w15:restartNumberingAfterBreak="0">
+  <w:abstractNum w:abstractNumId="5" w15:restartNumberingAfterBreak="0">
     <w:nsid w:val="6D854568"/>
     <w:multiLevelType w:val="hybridMultilevel"/>
     <w:tmpl w:val="AFD85C9A"/>
@@ -2286,18 +2790,21 @@
     </w:lvl>
   </w:abstractNum>
   <w:num w:numId="1" w16cid:durableId="1154493544">
+    <w:abstractNumId w:val="5"/>
+  </w:num>
+  <w:num w:numId="2" w16cid:durableId="663894252">
+    <w:abstractNumId w:val="2"/>
+  </w:num>
+  <w:num w:numId="3" w16cid:durableId="1757902910">
     <w:abstractNumId w:val="4"/>
   </w:num>
-  <w:num w:numId="2" w16cid:durableId="663894252">
+  <w:num w:numId="4" w16cid:durableId="1012336193">
+    <w:abstractNumId w:val="3"/>
+  </w:num>
+  <w:num w:numId="5" w16cid:durableId="1143695344">
     <w:abstractNumId w:val="1"/>
   </w:num>
-  <w:num w:numId="3" w16cid:durableId="1757902910">
-    <w:abstractNumId w:val="3"/>
-  </w:num>
-  <w:num w:numId="4" w16cid:durableId="1012336193">
-    <w:abstractNumId w:val="2"/>
-  </w:num>
-  <w:num w:numId="5" w16cid:durableId="1143695344">
+  <w:num w:numId="6" w16cid:durableId="463353429">
     <w:abstractNumId w:val="0"/>
   </w:num>
 </w:numbering>
@@ -2703,6 +3210,7 @@
   <w:style w:type="paragraph" w:default="1" w:styleId="Normal">
     <w:name w:val="Normal"/>
     <w:qFormat/>
+    <w:rsid w:val="00DC6A3D"/>
   </w:style>
   <w:style w:type="paragraph" w:styleId="Heading1">
     <w:name w:val="heading 1"/>
@@ -2731,7 +3239,6 @@
     <w:next w:val="Normal"/>
     <w:link w:val="Heading2Char"/>
     <w:uiPriority w:val="9"/>
-    <w:semiHidden/>
     <w:unhideWhenUsed/>
     <w:qFormat/>
     <w:rsid w:val="00121320"/>
@@ -2754,7 +3261,6 @@
     <w:next w:val="Normal"/>
     <w:link w:val="Heading3Char"/>
     <w:uiPriority w:val="9"/>
-    <w:semiHidden/>
     <w:unhideWhenUsed/>
     <w:qFormat/>
     <w:rsid w:val="00121320"/>
@@ -2948,7 +3454,6 @@
     <w:basedOn w:val="DefaultParagraphFont"/>
     <w:link w:val="Heading2"/>
     <w:uiPriority w:val="9"/>
-    <w:semiHidden/>
     <w:rsid w:val="00121320"/>
     <w:rPr>
       <w:rFonts w:asciiTheme="majorHAnsi" w:eastAsiaTheme="majorEastAsia" w:hAnsiTheme="majorHAnsi" w:cstheme="majorBidi"/>
@@ -2962,7 +3467,6 @@
     <w:basedOn w:val="DefaultParagraphFont"/>
     <w:link w:val="Heading3"/>
     <w:uiPriority w:val="9"/>
-    <w:semiHidden/>
     <w:rsid w:val="00121320"/>
     <w:rPr>
       <w:rFonts w:eastAsiaTheme="majorEastAsia" w:cstheme="majorBidi"/>

</xml_diff>

<commit_message>
new notes about hadoop and spakr
</commit_message>
<xml_diff>
--- a/terraform/terraform notes.docx
+++ b/terraform/terraform notes.docx
@@ -1558,6 +1558,7 @@
       </w:pPr>
       <w:r>
         <w:rPr>
+          <w:noProof/>
           <w:lang w:val="pl-PL"/>
         </w:rPr>
         <w:lastRenderedPageBreak/>
@@ -1600,6 +1601,36 @@
     </w:p>
     <w:p>
       <w:pPr>
+        <w:pStyle w:val="Heading2"/>
+        <w:rPr>
+          <w:lang w:val="pl-PL"/>
+        </w:rPr>
+      </w:pPr>
+      <w:r>
+        <w:rPr>
+          <w:lang w:val="pl-PL"/>
+        </w:rPr>
+        <w:t>Troubleshooting</w:t>
+      </w:r>
+    </w:p>
+    <w:p>
+      <w:r>
+        <w:t xml:space="preserve">Logs from executing a bash script on VM can be found on that VM in the /var/lib/waagent/custom-script/download/0 folder. There are the 'stdout' and 'stderr' files with logs. More info about that here: </w:t>
+      </w:r>
+      <w:hyperlink r:id="rId13" w:history="1">
+        <w:r>
+          <w:rPr>
+            <w:rStyle w:val="Hyperlink"/>
+          </w:rPr>
+          <w:t>learn.microsoft.com</w:t>
+        </w:r>
+      </w:hyperlink>
+      <w:r>
+        <w:t>.</w:t>
+      </w:r>
+    </w:p>
+    <w:p>
+      <w:pPr>
         <w:pStyle w:val="Heading1"/>
       </w:pPr>
       <w:r>
@@ -1658,6 +1689,7 @@
         <w:pStyle w:val="Heading1"/>
       </w:pPr>
       <w:r>
+        <w:lastRenderedPageBreak/>
         <w:t>Modules</w:t>
       </w:r>
     </w:p>
@@ -1685,135 +1717,123 @@
         <w:rPr>
           <w:lang w:val="pl-PL"/>
         </w:rPr>
+        <w:t>Providers in modules</w:t>
+      </w:r>
+    </w:p>
+    <w:p>
+      <w:pPr>
+        <w:rPr>
+          <w:lang w:val="pl-PL"/>
+        </w:rPr>
+      </w:pPr>
+      <w:r>
+        <w:rPr>
+          <w:lang w:val="pl-PL"/>
+        </w:rPr>
+        <w:t xml:space="preserve">Sometimes </w:t>
+      </w:r>
+      <w:r>
+        <w:rPr>
+          <w:lang w:val="pl-PL"/>
+        </w:rPr>
+        <w:t>in the module we need to specify providers even though we have those providers defined in the root module.</w:t>
+      </w:r>
+    </w:p>
+    <w:p>
+      <w:pPr>
+        <w:pStyle w:val="Heading1"/>
+      </w:pPr>
+      <w:r>
+        <w:t>Terraform console</w:t>
+      </w:r>
+    </w:p>
+    <w:p>
+      <w:r>
+        <w:t>We can use the ‘terraform console’ command which will create a consol</w:t>
+      </w:r>
+      <w:r>
+        <w:t>e</w:t>
+      </w:r>
+      <w:r>
+        <w:t xml:space="preserve"> where we can test terraform commands, like different terraform functions.</w:t>
+      </w:r>
+    </w:p>
+    <w:p>
+      <w:pPr>
+        <w:pStyle w:val="Heading1"/>
+      </w:pPr>
+      <w:r>
+        <w:t>Drift</w:t>
+      </w:r>
+    </w:p>
+    <w:p>
+      <w:r>
+        <w:t>Drift is a situation when resources in cloud are different then those defined in Terraform configuration files. That when some resources have been created manually or by a different tool than Terraform. There are some tools in Terraform helping with that.</w:t>
+      </w:r>
+    </w:p>
+    <w:p>
+      <w:pPr>
+        <w:pStyle w:val="Heading1"/>
+      </w:pPr>
+      <w:r>
+        <w:t>Testing</w:t>
+      </w:r>
+    </w:p>
+    <w:p>
+      <w:r>
+        <w:t xml:space="preserve">There </w:t>
+      </w:r>
+      <w:r>
+        <w:t>are</w:t>
+      </w:r>
+      <w:r>
+        <w:t xml:space="preserve"> tool</w:t>
+      </w:r>
+      <w:r>
+        <w:t>s helping with testing if our code is correct. Not only if that code will work without errors but if it is gonna work as excpected</w:t>
+      </w:r>
+      <w:r>
+        <w:t xml:space="preserve"> and we are not violating any </w:t>
+      </w:r>
+      <w:r>
+        <w:t xml:space="preserve">common </w:t>
+      </w:r>
+      <w:r>
+        <w:t>rules.</w:t>
+      </w:r>
+    </w:p>
+    <w:p>
+      <w:pPr>
+        <w:pStyle w:val="Heading2"/>
+      </w:pPr>
+      <w:r>
+        <w:t>TFLint</w:t>
+      </w:r>
+    </w:p>
+    <w:p>
+      <w:r>
+        <w:t>The TFLint is a tool for testing if Terraform code is correct. It knows what are the available values for different arguments and can detect errors, for example if we use the ‘banana’ as argument for VM size it will know it is not acceptable value.</w:t>
+      </w:r>
+    </w:p>
+    <w:p>
+      <w:pPr>
+        <w:pStyle w:val="Heading2"/>
+      </w:pPr>
+      <w:r>
+        <w:t>Checkov</w:t>
+      </w:r>
+    </w:p>
+    <w:p>
+      <w:r>
+        <w:t>The checkov is a tool for checking if we are exposing confidential data in our code</w:t>
+      </w:r>
+      <w:r>
+        <w:t xml:space="preserve"> or if we are following the recommended best practices for our code, like do we have all the recommended settings.</w:t>
+      </w:r>
+    </w:p>
+    <w:p>
+      <w:r>
         <w:lastRenderedPageBreak/>
-        <w:t>P</w:t>
-      </w:r>
-      <w:r>
-        <w:rPr>
-          <w:lang w:val="pl-PL"/>
-        </w:rPr>
-        <w:t>roviders</w:t>
-      </w:r>
-      <w:r>
-        <w:rPr>
-          <w:lang w:val="pl-PL"/>
-        </w:rPr>
-        <w:t xml:space="preserve"> in modules</w:t>
-      </w:r>
-    </w:p>
-    <w:p>
-      <w:pPr>
-        <w:rPr>
-          <w:lang w:val="pl-PL"/>
-        </w:rPr>
-      </w:pPr>
-      <w:r>
-        <w:rPr>
-          <w:lang w:val="pl-PL"/>
-        </w:rPr>
-        <w:t xml:space="preserve">Sometimes </w:t>
-      </w:r>
-      <w:r>
-        <w:rPr>
-          <w:lang w:val="pl-PL"/>
-        </w:rPr>
-        <w:t>in the module we need to specify providers even though we have those providers defined in the root module.</w:t>
-      </w:r>
-    </w:p>
-    <w:p>
-      <w:pPr>
-        <w:pStyle w:val="Heading1"/>
-      </w:pPr>
-      <w:r>
-        <w:t>Terraform console</w:t>
-      </w:r>
-    </w:p>
-    <w:p>
-      <w:r>
-        <w:t>We can use the ‘terraform console’ command which will create a consol</w:t>
-      </w:r>
-      <w:r>
-        <w:t>e</w:t>
-      </w:r>
-      <w:r>
-        <w:t xml:space="preserve"> where we can test terraform commands, like different terraform functions.</w:t>
-      </w:r>
-    </w:p>
-    <w:p>
-      <w:pPr>
-        <w:pStyle w:val="Heading1"/>
-      </w:pPr>
-      <w:r>
-        <w:t>Drift</w:t>
-      </w:r>
-    </w:p>
-    <w:p>
-      <w:r>
-        <w:t>Drift is a situation when resources in cloud are different then those defined in Terraform configuration files. That when some resources have been created manually or by a different tool than Terraform. There are some tools in Terraform helping with that.</w:t>
-      </w:r>
-    </w:p>
-    <w:p>
-      <w:pPr>
-        <w:pStyle w:val="Heading1"/>
-      </w:pPr>
-      <w:r>
-        <w:t>Testing</w:t>
-      </w:r>
-    </w:p>
-    <w:p>
-      <w:r>
-        <w:t xml:space="preserve">There </w:t>
-      </w:r>
-      <w:r>
-        <w:t>are</w:t>
-      </w:r>
-      <w:r>
-        <w:t xml:space="preserve"> tool</w:t>
-      </w:r>
-      <w:r>
-        <w:t>s helping with testing if our code is correct. Not only if that code will work without errors but if it is gonna work as excpected</w:t>
-      </w:r>
-      <w:r>
-        <w:t xml:space="preserve"> and we are not violating any </w:t>
-      </w:r>
-      <w:r>
-        <w:t xml:space="preserve">common </w:t>
-      </w:r>
-      <w:r>
-        <w:t>rules.</w:t>
-      </w:r>
-    </w:p>
-    <w:p>
-      <w:pPr>
-        <w:pStyle w:val="Heading2"/>
-      </w:pPr>
-      <w:r>
-        <w:t>TFLint</w:t>
-      </w:r>
-    </w:p>
-    <w:p>
-      <w:r>
-        <w:t>The TFLint is a tool for testing if Terraform code is correct. It knows what are the available values for different arguments and can detect errors, for example if we use the ‘banana’ as argument for VM size it will know it is not acceptable value.</w:t>
-      </w:r>
-    </w:p>
-    <w:p>
-      <w:pPr>
-        <w:pStyle w:val="Heading2"/>
-      </w:pPr>
-      <w:r>
-        <w:t>Checkov</w:t>
-      </w:r>
-    </w:p>
-    <w:p>
-      <w:r>
-        <w:t>The checkov is a tool for checking if we are exposing confidential data in our code</w:t>
-      </w:r>
-      <w:r>
-        <w:t xml:space="preserve"> or if we are following the recommended best practices for our code, like do we have all the recommended settings.</w:t>
-      </w:r>
-    </w:p>
-    <w:p>
-      <w:r>
         <w:t>It also allows us to define our own rules (policies) which should be followed when writing a code and it can automatically validate them.</w:t>
       </w:r>
     </w:p>
@@ -1867,7 +1887,6 @@
         </w:numPr>
       </w:pPr>
       <w:r>
-        <w:lastRenderedPageBreak/>
         <w:t>Snyk</w:t>
       </w:r>
     </w:p>
@@ -1960,10 +1979,7 @@
         <w:pStyle w:val="Heading3"/>
       </w:pPr>
       <w:r>
-        <w:t>Variables v</w:t>
-      </w:r>
-      <w:r>
-        <w:t>alidation</w:t>
+        <w:t>Variables validation</w:t>
       </w:r>
     </w:p>
     <w:p>
@@ -3412,7 +3428,6 @@
   <w:style w:type="character" w:default="1" w:styleId="DefaultParagraphFont">
     <w:name w:val="Default Paragraph Font"/>
     <w:uiPriority w:val="1"/>
-    <w:semiHidden/>
     <w:unhideWhenUsed/>
   </w:style>
   <w:style w:type="table" w:default="1" w:styleId="TableNormal">

</xml_diff>